<commit_message>
feat(auth): Phan quyen 4 tai khoan demo voi thanh chuyen role nhanh, banner vai tro, phan quyen RACI va dinh vi cay to chuc
</commit_message>
<xml_diff>
--- a/SPEC/SRS_TN_EDU_Demo.docx
+++ b/SPEC/SRS_TN_EDU_Demo.docx
@@ -3517,6 +3517,48 @@
           </w:p>
         </w:tc>
       </w:tr>
+      <w:tr>
+        <w:tc>
+          <w:tcPr>
+            <w:tcW w:type="dxa" w:w="700"/>
+          </w:tcPr>
+          <w:p>
+            <w:r>
+              <w:t>M12</w:t>
+            </w:r>
+          </w:p>
+        </w:tc>
+        <w:tc>
+          <w:tcPr>
+            <w:tcW w:type="dxa" w:w="3000"/>
+          </w:tcPr>
+          <w:p>
+            <w:r>
+              <w:t>Cấu hình hệ thống: Tài khoản, Phân quyền &amp; Điểm trường (gồm Giáo viên theo điểm trường)</w:t>
+            </w:r>
+          </w:p>
+        </w:tc>
+        <w:tc>
+          <w:tcPr>
+            <w:tcW w:type="dxa" w:w="2900"/>
+          </w:tcPr>
+          <w:p>
+            <w:r>
+              <w:t>3.1, 18.1–18.6 (mở rộng UI quản trị)</w:t>
+            </w:r>
+          </w:p>
+        </w:tc>
+        <w:tc>
+          <w:tcPr>
+            <w:tcW w:type="dxa" w:w="1400"/>
+          </w:tcPr>
+          <w:p>
+            <w:r>
+              <w:t>Nền tảng</w:t>
+            </w:r>
+          </w:p>
+        </w:tc>
+      </w:tr>
     </w:tbl>
     <w:p>
       <w:pPr>
@@ -5837,6 +5879,236 @@
     <w:p>
       <w:r>
         <w:br w:type="page"/>
+      </w:r>
+    </w:p>
+    <w:p>
+      <w:pPr>
+        <w:pStyle w:val="Heading2"/>
+      </w:pPr>
+      <w:r>
+        <w:t>5.12 M12 – Cấu hình hệ thống: Tài khoản, Phân quyền &amp; Điểm trường</w:t>
+      </w:r>
+    </w:p>
+    <w:p>
+      <w:pPr>
+        <w:pStyle w:val="Heading3"/>
+      </w:pPr>
+      <w:r>
+        <w:t>5.12.1 Quản lý tài khoản và phân quyền</w:t>
+      </w:r>
+    </w:p>
+    <w:p>
+      <w:r>
+        <w:t>Tác nhân: Admin, Hiệu trưởng</w:t>
+      </w:r>
+    </w:p>
+    <w:p>
+      <w:r>
+        <w:t>Hiện tại hệ thống mới chỉ enforce phân quyền ở tầng API (M11) nhưng chưa có màn hình cho Admin/Hiệu trưởng tự tạo tài khoản mới, khoá tài khoản nghỉ việc, hay gán/đổi vai trò và phạm vi phụ trách khi có biến động nhân sự. Mục này bổ sung màn hình "Cấu hình hệ thống" để quản trị các việc đó mà không cần can thiệp trực tiếp vào cơ sở dữ liệu.</w:t>
+      </w:r>
+    </w:p>
+    <w:p>
+      <w:r>
+        <w:t>Các bước chính:</w:t>
+      </w:r>
+    </w:p>
+    <w:p>
+      <w:pPr>
+        <w:pStyle w:val="ListParagraph"/>
+      </w:pPr>
+      <w:r>
+        <w:t>1. Admin/Hiệu trưởng vào "Cấu hình hệ thống" → tab "Tài khoản": tìm, lọc theo điểm trường/tổ/vai trò/trạng thái, tạo tài khoản mới, sửa thông tin, khoá/mở khoá, đặt lại mật khẩu về mặc định.</w:t>
+      </w:r>
+    </w:p>
+    <w:p>
+      <w:pPr>
+        <w:pStyle w:val="ListParagraph"/>
+      </w:pPr>
+      <w:r>
+        <w:t>2. Chuyển sang tab "Phân quyền": chọn 1 tài khoản, xem các vai trò + phạm vi hiện có dạng chip, thêm hoặc gỡ vai trò/phạm vi cho tài khoản đó (mỗi tài khoản luôn còn ít nhất 1 vai trò).</w:t>
+      </w:r>
+    </w:p>
+    <w:p>
+      <w:pPr>
+        <w:pStyle w:val="ListParagraph"/>
+      </w:pPr>
+      <w:r>
+        <w:t>3. Xem "Bảng quyền tham khảo" liệt kê mỗi vai trò được phép làm gì trong phạm vi demo, phục vụ tra cứu khi phân vai trò cho người mới.</w:t>
+      </w:r>
+    </w:p>
+    <w:p>
+      <w:r>
+        <w:t>Lưu ý UX:</w:t>
+      </w:r>
+    </w:p>
+    <w:p>
+      <w:pPr>
+        <w:pStyle w:val="ListParagraph"/>
+      </w:pPr>
+      <w:r>
+        <w:t>Mọi hành động khoá tài khoản, gỡ vai trò, xoá điểm trường đều có hộp xác nhận nêu rõ hậu quả bằng tiếng Việt đơn giản.</w:t>
+      </w:r>
+    </w:p>
+    <w:p>
+      <w:pPr>
+        <w:pStyle w:val="ListParagraph"/>
+      </w:pPr>
+      <w:r>
+        <w:t>Phân quyền ở bản demo dùng ma trận cố định theo vai trò (đã có ở M11); màn hình này chỉ quản lý việc GÁN vai trò cho từng tài khoản, chưa hỗ trợ tuỳ biến chi tiết từng quyền.</w:t>
+      </w:r>
+    </w:p>
+    <w:p>
+      <w:r>
+        <w:t>Tiêu chí chấp nhận:</w:t>
+      </w:r>
+    </w:p>
+    <w:p>
+      <w:pPr>
+        <w:pStyle w:val="ListParagraph"/>
+      </w:pPr>
+      <w:r>
+        <w:t>Admin tạo được 1 tài khoản mới, gán đúng vai trò + phạm vi, và tài khoản đó đăng nhập được ngay với đúng quyền hạn tương ứng.</w:t>
+      </w:r>
+    </w:p>
+    <w:p>
+      <w:pPr>
+        <w:pStyle w:val="ListParagraph"/>
+      </w:pPr>
+      <w:r>
+        <w:t>Khoá 1 tài khoản thì tài khoản đó không đăng nhập được nữa; mở khoá lại thì đăng nhập được bình thường.</w:t>
+      </w:r>
+    </w:p>
+    <w:p>
+      <w:pPr>
+        <w:pStyle w:val="Heading3"/>
+      </w:pPr>
+      <w:r>
+        <w:t>5.12.2 Sửa và quản lý Điểm trường</w:t>
+      </w:r>
+    </w:p>
+    <w:p>
+      <w:r>
+        <w:t>Tác nhân: Admin, Hiệu trưởng</w:t>
+      </w:r>
+    </w:p>
+    <w:p>
+      <w:r>
+        <w:t>Bổ sung thao tác tạo/sửa/xoá điểm trường ngay trên giao diện (API đã có ở M2/Prompt 4 nhưng trước đây chưa có màn hình sử dụng cho việc sửa hay xoá, chỉ dùng để xem cây tổ chức).</w:t>
+      </w:r>
+    </w:p>
+    <w:p>
+      <w:r>
+        <w:t>Các bước chính:</w:t>
+      </w:r>
+    </w:p>
+    <w:p>
+      <w:pPr>
+        <w:pStyle w:val="ListParagraph"/>
+      </w:pPr>
+      <w:r>
+        <w:t>1. Tab "Điểm trường" trong "Cấu hình hệ thống" hiện danh sách điểm trường dạng thẻ kèm số nhân sự, số công việc đang triển khai, số công việc quá hạn.</w:t>
+      </w:r>
+    </w:p>
+    <w:p>
+      <w:pPr>
+        <w:pStyle w:val="ListParagraph"/>
+      </w:pPr>
+      <w:r>
+        <w:t>2. Bấm "+ Thêm điểm trường" hoặc "Sửa" trên 1 thẻ để mở form: tên, mã, địa chỉ, người phụ trách (chọn qua People Picker).</w:t>
+      </w:r>
+    </w:p>
+    <w:p>
+      <w:pPr>
+        <w:pStyle w:val="ListParagraph"/>
+      </w:pPr>
+      <w:r>
+        <w:t>3. Chỉ cho phép xoá điểm trường khi không còn nhân sự và không còn công việc nào gắn với điểm trường đó; ngược lại hệ thống báo rõ lý do không xoá được.</w:t>
+      </w:r>
+    </w:p>
+    <w:p>
+      <w:r>
+        <w:t>Tiêu chí chấp nhận:</w:t>
+      </w:r>
+    </w:p>
+    <w:p>
+      <w:pPr>
+        <w:pStyle w:val="ListParagraph"/>
+      </w:pPr>
+      <w:r>
+        <w:t>Tạo được 1 điểm trường mới và gán ngay 1 giáo viên vào điểm trường đó từ tab "Giáo viên theo điểm trường" (mục 5.13).</w:t>
+      </w:r>
+    </w:p>
+    <w:p>
+      <w:pPr>
+        <w:pStyle w:val="Heading2"/>
+      </w:pPr>
+      <w:r>
+        <w:t>5.13 M13 – Quản lý giáo viên/nhân viên theo điểm trường</w:t>
+      </w:r>
+    </w:p>
+    <w:p>
+      <w:r>
+        <w:t>Tác nhân: Admin, Hiệu trưởng, Phó Hiệu trưởng phụ trách điểm trường</w:t>
+      </w:r>
+    </w:p>
+    <w:p>
+      <w:r>
+        <w:t>Khác với Danh bạ/People Picker (M3, chỉ để TÌM và CHỌN người khi giao việc), mục này là màn hình QUẢN TRỊ nhân sự theo từng điểm trường: xem toàn bộ giáo viên/nhân viên đang gắn với 1 điểm trường, thêm người vào điểm trường, hoặc chuyển người sang điểm trường khác khi có điều chuyển/biến động nhân sự sau sáp nhập.</w:t>
+      </w:r>
+    </w:p>
+    <w:p>
+      <w:r>
+        <w:t>Các bước chính:</w:t>
+      </w:r>
+    </w:p>
+    <w:p>
+      <w:pPr>
+        <w:pStyle w:val="ListParagraph"/>
+      </w:pPr>
+      <w:r>
+        <w:t>1. Chọn 1 điểm trường từ dropdown trên cùng → xem danh sách đầy đủ giáo viên/nhân viên đang thuộc điểm trường đó (tên, tổ, chức vụ, số điện thoại bấm gọi được ngay, số việc đang xử lý).</w:t>
+      </w:r>
+    </w:p>
+    <w:p>
+      <w:pPr>
+        <w:pStyle w:val="ListParagraph"/>
+      </w:pPr>
+      <w:r>
+        <w:t>2. Thêm giáo viên vào điểm trường bằng cách tạo tài khoản mới (mở lại form tạo tài khoản ở mục 5.12 với điểm trường điền sẵn) hoặc chuyển một tài khoản có sẵn từ điểm trường khác sang.</w:t>
+      </w:r>
+    </w:p>
+    <w:p>
+      <w:pPr>
+        <w:pStyle w:val="ListParagraph"/>
+      </w:pPr>
+      <w:r>
+        <w:t>3. Với mỗi giáo viên, có thể bấm "Chuyển điểm trường" để đổi sang điểm trường khác — hệ thống cảnh báo nếu người này đang chủ trì công việc chưa đóng tại điểm trường hiện tại trước khi xác nhận chuyển.</w:t>
+      </w:r>
+    </w:p>
+    <w:p>
+      <w:r>
+        <w:t>Lưu ý UX:</w:t>
+      </w:r>
+    </w:p>
+    <w:p>
+      <w:pPr>
+        <w:pStyle w:val="ListParagraph"/>
+      </w:pPr>
+      <w:r>
+        <w:t>Danh sách hiển thị dạng bảng trên desktop, dạng thẻ cuộn dọc trên mobile, có ô tìm kiếm nhanh theo tên ngay trong danh sách đã tải.</w:t>
+      </w:r>
+    </w:p>
+    <w:p>
+      <w:r>
+        <w:t>Tiêu chí chấp nhận:</w:t>
+      </w:r>
+    </w:p>
+    <w:p>
+      <w:pPr>
+        <w:pStyle w:val="ListParagraph"/>
+      </w:pPr>
+      <w:r>
+        <w:t>Từ tab này, Admin/Hiệu trưởng chuyển được 1 giáo viên từ điểm trường này sang điểm trường khác trong tối đa 3 lần bấm, và giáo viên đó ngay lập tức xuất hiện đúng trong danh sách nhân sự của điểm trường mới.</w:t>
       </w:r>
     </w:p>
     <w:p>
@@ -7178,6 +7450,38 @@
           </w:p>
         </w:tc>
       </w:tr>
+      <w:tr>
+        <w:tc>
+          <w:tcPr>
+            <w:tcW w:type="dxa" w:w="2000"/>
+          </w:tcPr>
+          <w:p>
+            <w:r>
+              <w:t>AdminAuditLog (Nhật ký quản trị)</w:t>
+            </w:r>
+          </w:p>
+        </w:tc>
+        <w:tc>
+          <w:tcPr>
+            <w:tcW w:type="dxa" w:w="4600"/>
+          </w:tcPr>
+          <w:p>
+            <w:r>
+              <w:t>id, actorUserId, action, targetType, targetId, detail, createdAt</w:t>
+            </w:r>
+          </w:p>
+        </w:tc>
+        <w:tc>
+          <w:tcPr>
+            <w:tcW w:type="dxa" w:w="2400"/>
+          </w:tcPr>
+          <w:p>
+            <w:r>
+              <w:t>Ghi lại hành động tạo/sửa/khoá tài khoản, gán/gỡ vai trò, sửa/xoá điểm trường</w:t>
+            </w:r>
+          </w:p>
+        </w:tc>
+      </w:tr>
     </w:tbl>
     <w:p>
       <w:pPr>
@@ -8282,6 +8586,72 @@
                 <w:szCs w:val="20"/>
               </w:rPr>
               <w:t xml:space="preserve">Trung tâm thông báo</w:t>
+            </w:r>
+          </w:p>
+        </w:tc>
+      </w:tr>
+      <w:tr>
+        <w:tc>
+          <w:tcPr>
+            <w:tcW w:type="dxa" w:w="3200"/>
+          </w:tcPr>
+          <w:p>
+            <w:r>
+              <w:t>GET/POST/PATCH /api/admin/users, POST .../reset-password</w:t>
+            </w:r>
+          </w:p>
+        </w:tc>
+        <w:tc>
+          <w:tcPr>
+            <w:tcW w:type="dxa" w:w="5800"/>
+          </w:tcPr>
+          <w:p>
+            <w:r>
+              <w:t>Quản lý tài khoản (chỉ ADMIN/HIEU_TRUONG): danh sách, tạo, sửa, khoá/mở khoá, đặt lại mật khẩu</w:t>
+            </w:r>
+          </w:p>
+        </w:tc>
+      </w:tr>
+      <w:tr>
+        <w:tc>
+          <w:tcPr>
+            <w:tcW w:type="dxa" w:w="3200"/>
+          </w:tcPr>
+          <w:p>
+            <w:r>
+              <w:t>POST/DELETE /api/admin/users/:id/roles, GET /api/admin/permissions-matrix</w:t>
+            </w:r>
+          </w:p>
+        </w:tc>
+        <w:tc>
+          <w:tcPr>
+            <w:tcW w:type="dxa" w:w="5800"/>
+          </w:tcPr>
+          <w:p>
+            <w:r>
+              <w:t>Cấu hình phân quyền: gán/gỡ vai trò+phạm vi cho tài khoản, xem bảng quyền tham khảo</w:t>
+            </w:r>
+          </w:p>
+        </w:tc>
+      </w:tr>
+      <w:tr>
+        <w:tc>
+          <w:tcPr>
+            <w:tcW w:type="dxa" w:w="3200"/>
+          </w:tcPr>
+          <w:p>
+            <w:r>
+              <w:t>PATCH/DELETE /api/locations/:id, GET /api/locations/:id/summary</w:t>
+            </w:r>
+          </w:p>
+        </w:tc>
+        <w:tc>
+          <w:tcPr>
+            <w:tcW w:type="dxa" w:w="5800"/>
+          </w:tcPr>
+          <w:p>
+            <w:r>
+              <w:t>Sửa/xoá điểm trường, xem số liệu tổng quan (nhân sự, công việc) của điểm trường</w:t>
             </w:r>
           </w:p>
         </w:tc>

</xml_diff>